<commit_message>
gerando a primeira versão
</commit_message>
<xml_diff>
--- a/dados/tecnologo_automacao_2027_1/docs/Proposta_Reformulacao_Curso_MEC_FEELT_v9.docx
+++ b/dados/tecnologo_automacao_2027_1/docs/Proposta_Reformulacao_Curso_MEC_FEELT_v9.docx
@@ -4012,7 +4012,6 @@
         <w:t xml:space="preserve"> </w:t>
       </w:r>
       <w:proofErr w:type="spellStart"/>
-      <w:proofErr w:type="gramStart"/>
       <w:r>
         <w:t>acadêmica</w:t>
       </w:r>
@@ -4020,7 +4019,6 @@
       <w:r>
         <w:t>;</w:t>
       </w:r>
-      <w:proofErr w:type="gramEnd"/>
     </w:p>
     <w:p>
       <w:pPr>
@@ -4059,7 +4057,6 @@
         <w:t xml:space="preserve"> </w:t>
       </w:r>
       <w:proofErr w:type="spellStart"/>
-      <w:proofErr w:type="gramStart"/>
       <w:r>
         <w:t>estudantil</w:t>
       </w:r>
@@ -4067,7 +4064,6 @@
       <w:r>
         <w:t>;</w:t>
       </w:r>
-      <w:proofErr w:type="gramEnd"/>
     </w:p>
     <w:p>
       <w:pPr>
@@ -5210,6 +5206,19 @@
               </w:rPr>
               <w:t>Máquinas Inteligentes, Acionamentos e Proteção Industrial</w:t>
             </w:r>
+            <w:r>
+              <w:rPr>
+                <w:sz w:val="20"/>
+                <w:lang w:val="pt-BR"/>
+              </w:rPr>
+              <w:t xml:space="preserve"> - </w:t>
+            </w:r>
+            <w:r>
+              <w:rPr>
+                <w:sz w:val="20"/>
+              </w:rPr>
+              <w:t>MIAPI</w:t>
+            </w:r>
           </w:p>
         </w:tc>
         <w:tc>
@@ -5275,15 +5284,33 @@
               </w:rPr>
               <w:t xml:space="preserve">Robótica Autônoma e Sistemas </w:t>
             </w:r>
-            <w:proofErr w:type="spellStart"/>
             <w:r>
               <w:rPr>
                 <w:sz w:val="20"/>
                 <w:lang w:val="pt-BR"/>
               </w:rPr>
-              <w:t>Ciberfísicos</w:t>
-            </w:r>
-            <w:proofErr w:type="spellEnd"/>
+              <w:t xml:space="preserve">de </w:t>
+            </w:r>
+            <w:r>
+              <w:rPr>
+                <w:sz w:val="20"/>
+                <w:lang w:val="pt-BR"/>
+              </w:rPr>
+              <w:t>C</w:t>
+            </w:r>
+            <w:r>
+              <w:rPr>
+                <w:sz w:val="20"/>
+                <w:lang w:val="pt-BR"/>
+              </w:rPr>
+              <w:t xml:space="preserve">ontrole - </w:t>
+            </w:r>
+            <w:r>
+              <w:rPr>
+                <w:sz w:val="20"/>
+              </w:rPr>
+              <w:t>RASC</w:t>
+            </w:r>
           </w:p>
         </w:tc>
         <w:tc>
@@ -5364,6 +5391,19 @@
                 <w:lang w:val="pt-BR"/>
               </w:rPr>
               <w:t>Sistemas Embarcados, IoT e Computação Inteligente</w:t>
+            </w:r>
+            <w:r>
+              <w:rPr>
+                <w:sz w:val="20"/>
+                <w:lang w:val="pt-BR"/>
+              </w:rPr>
+              <w:t xml:space="preserve"> - </w:t>
+            </w:r>
+            <w:r>
+              <w:rPr>
+                <w:sz w:val="20"/>
+              </w:rPr>
+              <w:t>SEICI</w:t>
             </w:r>
           </w:p>
         </w:tc>
@@ -7699,7 +7739,6 @@
   <w:style w:type="character" w:default="1" w:styleId="Fontepargpadro">
     <w:name w:val="Default Paragraph Font"/>
     <w:uiPriority w:val="1"/>
-    <w:semiHidden/>
     <w:unhideWhenUsed/>
   </w:style>
   <w:style w:type="table" w:default="1" w:styleId="Tabelanormal">

</xml_diff>